<commit_message>
Report generator optimization (#3562)
Signed-off-by: Xiaojing Liu <xiaojing.liu@intel.com>
</commit_message>
<xml_diff>
--- a/smart-classroom/components/report_generator/templates/report_template_en.docx
+++ b/smart-classroom/components/report_generator/templates/report_template_en.docx
@@ -58,7 +58,7 @@
         <w:pStyle w:val="ListNumber"/>
       </w:pPr>
       <w:r>
-        <w:t>Actual Attendance: {attendance} students</w:t>
+        <w:t>Actual Attendance: {attendance}</w:t>
       </w:r>
     </w:p>
     <w:p>
@@ -74,7 +74,7 @@
         <w:pStyle w:val="ListNumber"/>
       </w:pPr>
       <w:r>
-        <w:t>Teacher asked {question_count} questions.</w:t>
+        <w:t>Teacher asked {question_count}.</w:t>
       </w:r>
     </w:p>
     <w:p>
@@ -90,7 +90,7 @@
         <w:pStyle w:val="ListNumber"/>
       </w:pPr>
       <w:r>
-        <w:t>Average speaking speed: {speaking_speed} characters/minute.</w:t>
+        <w:t>Average speaking speed: {speaking_speed}.</w:t>
       </w:r>
     </w:p>
     <w:p>
@@ -114,7 +114,7 @@
         <w:pStyle w:val="ListNumber"/>
       </w:pPr>
       <w:r>
-        <w:t>Active hand-raising: {hand_raise_count} person-times.</w:t>
+        <w:t>Active hand-raising: {hand_raise_count}.</w:t>
       </w:r>
     </w:p>
     <w:p>
@@ -122,7 +122,7 @@
         <w:pStyle w:val="ListNumber"/>
       </w:pPr>
       <w:r>
-        <w:t>Average hand-raising frequency: {hand_raise_avg} times per person.</w:t>
+        <w:t>Average hand-raising frequency: {hand_raise_avg}.</w:t>
       </w:r>
     </w:p>
     <w:p>
@@ -135,7 +135,7 @@
     </w:p>
     <w:p>
       <w:r>
-        <w:t>System automatically extracted {keywords_count} keywords: {keywords}</w:t>
+        <w:t>System automatically extracted keywords{keywords_count_note}: {keywords}</w:t>
       </w:r>
     </w:p>
     <w:p/>

</xml_diff>